<commit_message>
Corrige Figura 1 y roles de CAL-SOP-01; ajusta extracción de numeración
</commit_message>
<xml_diff>
--- a/01_INTEGRACION/CAL-SOP-01-V1-2025_INTEGRADO.docx
+++ b/01_INTEGRACION/CAL-SOP-01-V1-2025_INTEGRADO.docx
@@ -3860,28 +3860,28 @@
         <w:jc w:val="both"/>
       </w:pPr>
       <w:r>
-        <w:t xml:space="preserve">El responsable de garantías </w:t>
-      </w:r>
-      <w:r>
-        <w:t>es el responsable directo de</w:t>
+        <w:t xml:space="preserve">Aseguramiento de la Calidad es responsable de </w:t>
+      </w:r>
+      <w:r>
+        <w:t/>
+      </w:r>
+      <w:r>
+        <w:t xml:space="preserve"/>
+      </w:r>
+      <w:r>
+        <w:t>atender</w:t>
       </w:r>
       <w:r>
         <w:t xml:space="preserve"> </w:t>
       </w:r>
       <w:r>
-        <w:t>atender</w:t>
-      </w:r>
-      <w:r>
-        <w:t xml:space="preserve"> </w:t>
-      </w:r>
-      <w:r>
-        <w:t>(</w:t>
+        <w:t/>
       </w:r>
       <w:r>
         <w:t>o remitir</w:t>
       </w:r>
       <w:r>
-        <w:t>)</w:t>
+        <w:t/>
       </w:r>
       <w:r>
         <w:t xml:space="preserve"> la información al canal oficial de comunicación, como mínimo, cuando se </w:t>
@@ -7057,10 +7057,10 @@
         <w:t xml:space="preserve"> </w:t>
       </w:r>
       <w:r>
-        <w:t>por el encargado de garantías</w:t>
-      </w:r>
-      <w:r>
-        <w:t>,</w:t>
+        <w:t>por Aseguramiento de la Calidad</w:t>
+      </w:r>
+      <w:r>
+        <w:t/>
       </w:r>
       <w:r>
         <w:t xml:space="preserve"> </w:t>
@@ -8043,7 +8043,7 @@
         <w:jc w:val="both"/>
       </w:pPr>
       <w:r>
-        <w:t>Asignar un presupuesto simbólico, definido a criterio del responsable de garantías y del Gerente de Proyectos.</w:t>
+        <w:t>Asignar un presupuesto simbólico, definido a criterio de Aseguramiento de la Calidad y del Gerente de Proyectos.</w:t>
       </w:r>
     </w:p>
     <w:p>

</xml_diff>